<commit_message>
Fix: Re-added missing screenshots to assignment document
</commit_message>
<xml_diff>
--- a/Git_Assignment1_A00487441.docx
+++ b/Git_Assignment1_A00487441.docx
@@ -73,6 +73,117 @@
     </w:p>
     <w:p>
       <w:r>
+        <w:drawing>
+          <wp:inline xmlns:a="http://schemas.openxmlformats.org/drawingml/2006/main" xmlns:pic="http://schemas.openxmlformats.org/drawingml/2006/picture">
+            <wp:extent cx="5486400" cy="365760"/>
+            <wp:docPr id="1" name="Picture 1"/>
+            <wp:cNvGraphicFramePr>
+              <a:graphicFrameLocks noChangeAspect="1"/>
+            </wp:cNvGraphicFramePr>
+            <a:graphic>
+              <a:graphicData uri="http://schemas.openxmlformats.org/drawingml/2006/picture">
+                <pic:pic>
+                  <pic:nvPicPr>
+                    <pic:cNvPr id="0" name="screenshot_q1_clone.png"/>
+                    <pic:cNvPicPr/>
+                  </pic:nvPicPr>
+                  <pic:blipFill>
+                    <a:blip r:embed="rId9"/>
+                    <a:stretch>
+                      <a:fillRect/>
+                    </a:stretch>
+                  </pic:blipFill>
+                  <pic:spPr>
+                    <a:xfrm>
+                      <a:off x="0" y="0"/>
+                      <a:ext cx="5486400" cy="365760"/>
+                    </a:xfrm>
+                    <a:prstGeom prst="rect"/>
+                  </pic:spPr>
+                </pic:pic>
+              </a:graphicData>
+            </a:graphic>
+          </wp:inline>
+        </w:drawing>
+      </w:r>
+    </w:p>
+    <w:p/>
+    <w:p>
+      <w:r>
+        <w:drawing>
+          <wp:inline xmlns:a="http://schemas.openxmlformats.org/drawingml/2006/main" xmlns:pic="http://schemas.openxmlformats.org/drawingml/2006/picture">
+            <wp:extent cx="5486400" cy="1042737"/>
+            <wp:docPr id="2" name="Picture 2"/>
+            <wp:cNvGraphicFramePr>
+              <a:graphicFrameLocks noChangeAspect="1"/>
+            </wp:cNvGraphicFramePr>
+            <a:graphic>
+              <a:graphicData uri="http://schemas.openxmlformats.org/drawingml/2006/picture">
+                <pic:pic>
+                  <pic:nvPicPr>
+                    <pic:cNvPr id="0" name="screenshot_q1_status.png"/>
+                    <pic:cNvPicPr/>
+                  </pic:nvPicPr>
+                  <pic:blipFill>
+                    <a:blip r:embed="rId10"/>
+                    <a:stretch>
+                      <a:fillRect/>
+                    </a:stretch>
+                  </pic:blipFill>
+                  <pic:spPr>
+                    <a:xfrm>
+                      <a:off x="0" y="0"/>
+                      <a:ext cx="5486400" cy="1042737"/>
+                    </a:xfrm>
+                    <a:prstGeom prst="rect"/>
+                  </pic:spPr>
+                </pic:pic>
+              </a:graphicData>
+            </a:graphic>
+          </wp:inline>
+        </w:drawing>
+      </w:r>
+    </w:p>
+    <w:p/>
+    <w:p>
+      <w:r>
+        <w:drawing>
+          <wp:inline xmlns:a="http://schemas.openxmlformats.org/drawingml/2006/main" xmlns:pic="http://schemas.openxmlformats.org/drawingml/2006/picture">
+            <wp:extent cx="5486400" cy="802105"/>
+            <wp:docPr id="3" name="Picture 3"/>
+            <wp:cNvGraphicFramePr>
+              <a:graphicFrameLocks noChangeAspect="1"/>
+            </wp:cNvGraphicFramePr>
+            <a:graphic>
+              <a:graphicData uri="http://schemas.openxmlformats.org/drawingml/2006/picture">
+                <pic:pic>
+                  <pic:nvPicPr>
+                    <pic:cNvPr id="0" name="screenshot_q1_branch.png"/>
+                    <pic:cNvPicPr/>
+                  </pic:nvPicPr>
+                  <pic:blipFill>
+                    <a:blip r:embed="rId11"/>
+                    <a:stretch>
+                      <a:fillRect/>
+                    </a:stretch>
+                  </pic:blipFill>
+                  <pic:spPr>
+                    <a:xfrm>
+                      <a:off x="0" y="0"/>
+                      <a:ext cx="5486400" cy="802105"/>
+                    </a:xfrm>
+                    <a:prstGeom prst="rect"/>
+                  </pic:spPr>
+                </pic:pic>
+              </a:graphicData>
+            </a:graphic>
+          </wp:inline>
+        </w:drawing>
+      </w:r>
+    </w:p>
+    <w:p/>
+    <w:p>
+      <w:r>
         <w:br w:type="page"/>
       </w:r>
     </w:p>
@@ -89,6 +200,117 @@
         <w:t>Two files, 'countries.txt' and 'shapes.txt', were created and committed. Subsequently, 'numbers.txt' was added and committed. The commit history was then viewed using 'git log --oneline'.</w:t>
       </w:r>
     </w:p>
+    <w:p>
+      <w:r>
+        <w:drawing>
+          <wp:inline xmlns:a="http://schemas.openxmlformats.org/drawingml/2006/main" xmlns:pic="http://schemas.openxmlformats.org/drawingml/2006/picture">
+            <wp:extent cx="5486400" cy="368710"/>
+            <wp:docPr id="4" name="Picture 4"/>
+            <wp:cNvGraphicFramePr>
+              <a:graphicFrameLocks noChangeAspect="1"/>
+            </wp:cNvGraphicFramePr>
+            <a:graphic>
+              <a:graphicData uri="http://schemas.openxmlformats.org/drawingml/2006/picture">
+                <pic:pic>
+                  <pic:nvPicPr>
+                    <pic:cNvPr id="0" name="screenshot_q2_commit1.png"/>
+                    <pic:cNvPicPr/>
+                  </pic:nvPicPr>
+                  <pic:blipFill>
+                    <a:blip r:embed="rId12"/>
+                    <a:stretch>
+                      <a:fillRect/>
+                    </a:stretch>
+                  </pic:blipFill>
+                  <pic:spPr>
+                    <a:xfrm>
+                      <a:off x="0" y="0"/>
+                      <a:ext cx="5486400" cy="368710"/>
+                    </a:xfrm>
+                    <a:prstGeom prst="rect"/>
+                  </pic:spPr>
+                </pic:pic>
+              </a:graphicData>
+            </a:graphic>
+          </wp:inline>
+        </w:drawing>
+      </w:r>
+    </w:p>
+    <w:p/>
+    <w:p>
+      <w:r>
+        <w:drawing>
+          <wp:inline xmlns:a="http://schemas.openxmlformats.org/drawingml/2006/main" xmlns:pic="http://schemas.openxmlformats.org/drawingml/2006/picture">
+            <wp:extent cx="5486400" cy="466531"/>
+            <wp:docPr id="5" name="Picture 5"/>
+            <wp:cNvGraphicFramePr>
+              <a:graphicFrameLocks noChangeAspect="1"/>
+            </wp:cNvGraphicFramePr>
+            <a:graphic>
+              <a:graphicData uri="http://schemas.openxmlformats.org/drawingml/2006/picture">
+                <pic:pic>
+                  <pic:nvPicPr>
+                    <pic:cNvPr id="0" name="screenshot_q2_commit2.png"/>
+                    <pic:cNvPicPr/>
+                  </pic:nvPicPr>
+                  <pic:blipFill>
+                    <a:blip r:embed="rId13"/>
+                    <a:stretch>
+                      <a:fillRect/>
+                    </a:stretch>
+                  </pic:blipFill>
+                  <pic:spPr>
+                    <a:xfrm>
+                      <a:off x="0" y="0"/>
+                      <a:ext cx="5486400" cy="466531"/>
+                    </a:xfrm>
+                    <a:prstGeom prst="rect"/>
+                  </pic:spPr>
+                </pic:pic>
+              </a:graphicData>
+            </a:graphic>
+          </wp:inline>
+        </w:drawing>
+      </w:r>
+    </w:p>
+    <w:p/>
+    <w:p>
+      <w:r>
+        <w:drawing>
+          <wp:inline xmlns:a="http://schemas.openxmlformats.org/drawingml/2006/main" xmlns:pic="http://schemas.openxmlformats.org/drawingml/2006/picture">
+            <wp:extent cx="5486400" cy="928688"/>
+            <wp:docPr id="6" name="Picture 6"/>
+            <wp:cNvGraphicFramePr>
+              <a:graphicFrameLocks noChangeAspect="1"/>
+            </wp:cNvGraphicFramePr>
+            <a:graphic>
+              <a:graphicData uri="http://schemas.openxmlformats.org/drawingml/2006/picture">
+                <pic:pic>
+                  <pic:nvPicPr>
+                    <pic:cNvPr id="0" name="screenshot_q2_log.png"/>
+                    <pic:cNvPicPr/>
+                  </pic:nvPicPr>
+                  <pic:blipFill>
+                    <a:blip r:embed="rId14"/>
+                    <a:stretch>
+                      <a:fillRect/>
+                    </a:stretch>
+                  </pic:blipFill>
+                  <pic:spPr>
+                    <a:xfrm>
+                      <a:off x="0" y="0"/>
+                      <a:ext cx="5486400" cy="928688"/>
+                    </a:xfrm>
+                    <a:prstGeom prst="rect"/>
+                  </pic:spPr>
+                </pic:pic>
+              </a:graphicData>
+            </a:graphic>
+          </wp:inline>
+        </w:drawing>
+      </w:r>
+    </w:p>
+    <w:p/>
     <w:p>
       <w:r>
         <w:br w:type="page"/>
@@ -109,6 +331,117 @@
     </w:p>
     <w:p>
       <w:r>
+        <w:drawing>
+          <wp:inline xmlns:a="http://schemas.openxmlformats.org/drawingml/2006/main" xmlns:pic="http://schemas.openxmlformats.org/drawingml/2006/picture">
+            <wp:extent cx="5486400" cy="617838"/>
+            <wp:docPr id="7" name="Picture 7"/>
+            <wp:cNvGraphicFramePr>
+              <a:graphicFrameLocks noChangeAspect="1"/>
+            </wp:cNvGraphicFramePr>
+            <a:graphic>
+              <a:graphicData uri="http://schemas.openxmlformats.org/drawingml/2006/picture">
+                <pic:pic>
+                  <pic:nvPicPr>
+                    <pic:cNvPr id="0" name="screenshot_q3_branch_create.png"/>
+                    <pic:cNvPicPr/>
+                  </pic:nvPicPr>
+                  <pic:blipFill>
+                    <a:blip r:embed="rId15"/>
+                    <a:stretch>
+                      <a:fillRect/>
+                    </a:stretch>
+                  </pic:blipFill>
+                  <pic:spPr>
+                    <a:xfrm>
+                      <a:off x="0" y="0"/>
+                      <a:ext cx="5486400" cy="617838"/>
+                    </a:xfrm>
+                    <a:prstGeom prst="rect"/>
+                  </pic:spPr>
+                </pic:pic>
+              </a:graphicData>
+            </a:graphic>
+          </wp:inline>
+        </w:drawing>
+      </w:r>
+    </w:p>
+    <w:p/>
+    <w:p>
+      <w:r>
+        <w:drawing>
+          <wp:inline xmlns:a="http://schemas.openxmlformats.org/drawingml/2006/main" xmlns:pic="http://schemas.openxmlformats.org/drawingml/2006/picture">
+            <wp:extent cx="5486400" cy="448235"/>
+            <wp:docPr id="8" name="Picture 8"/>
+            <wp:cNvGraphicFramePr>
+              <a:graphicFrameLocks noChangeAspect="1"/>
+            </wp:cNvGraphicFramePr>
+            <a:graphic>
+              <a:graphicData uri="http://schemas.openxmlformats.org/drawingml/2006/picture">
+                <pic:pic>
+                  <pic:nvPicPr>
+                    <pic:cNvPr id="0" name="screenshot_q3_commit.png"/>
+                    <pic:cNvPicPr/>
+                  </pic:nvPicPr>
+                  <pic:blipFill>
+                    <a:blip r:embed="rId16"/>
+                    <a:stretch>
+                      <a:fillRect/>
+                    </a:stretch>
+                  </pic:blipFill>
+                  <pic:spPr>
+                    <a:xfrm>
+                      <a:off x="0" y="0"/>
+                      <a:ext cx="5486400" cy="448235"/>
+                    </a:xfrm>
+                    <a:prstGeom prst="rect"/>
+                  </pic:spPr>
+                </pic:pic>
+              </a:graphicData>
+            </a:graphic>
+          </wp:inline>
+        </w:drawing>
+      </w:r>
+    </w:p>
+    <w:p/>
+    <w:p>
+      <w:r>
+        <w:drawing>
+          <wp:inline xmlns:a="http://schemas.openxmlformats.org/drawingml/2006/main" xmlns:pic="http://schemas.openxmlformats.org/drawingml/2006/picture">
+            <wp:extent cx="5486400" cy="1042737"/>
+            <wp:docPr id="9" name="Picture 9"/>
+            <wp:cNvGraphicFramePr>
+              <a:graphicFrameLocks noChangeAspect="1"/>
+            </wp:cNvGraphicFramePr>
+            <a:graphic>
+              <a:graphicData uri="http://schemas.openxmlformats.org/drawingml/2006/picture">
+                <pic:pic>
+                  <pic:nvPicPr>
+                    <pic:cNvPr id="0" name="screenshot_q3_branch_list.png"/>
+                    <pic:cNvPicPr/>
+                  </pic:nvPicPr>
+                  <pic:blipFill>
+                    <a:blip r:embed="rId17"/>
+                    <a:stretch>
+                      <a:fillRect/>
+                    </a:stretch>
+                  </pic:blipFill>
+                  <pic:spPr>
+                    <a:xfrm>
+                      <a:off x="0" y="0"/>
+                      <a:ext cx="5486400" cy="1042737"/>
+                    </a:xfrm>
+                    <a:prstGeom prst="rect"/>
+                  </pic:spPr>
+                </pic:pic>
+              </a:graphicData>
+            </a:graphic>
+          </wp:inline>
+        </w:drawing>
+      </w:r>
+    </w:p>
+    <w:p/>
+    <w:p>
+      <w:r>
         <w:br w:type="page"/>
       </w:r>
     </w:p>
@@ -125,6 +458,154 @@
         <w:t>Branches 'user1' and 'user2' were created to simulate a development scenario. A merge conflict was intentionally triggered by modifying 'countries.txt' in both branches and then merging 'user1' into 'combine_countries'. The conflict was resolved by combining changes from both branches.</w:t>
       </w:r>
     </w:p>
+    <w:p>
+      <w:r>
+        <w:drawing>
+          <wp:inline xmlns:a="http://schemas.openxmlformats.org/drawingml/2006/main" xmlns:pic="http://schemas.openxmlformats.org/drawingml/2006/picture">
+            <wp:extent cx="5486400" cy="754144"/>
+            <wp:docPr id="10" name="Picture 10"/>
+            <wp:cNvGraphicFramePr>
+              <a:graphicFrameLocks noChangeAspect="1"/>
+            </wp:cNvGraphicFramePr>
+            <a:graphic>
+              <a:graphicData uri="http://schemas.openxmlformats.org/drawingml/2006/picture">
+                <pic:pic>
+                  <pic:nvPicPr>
+                    <pic:cNvPr id="0" name="screenshot_q3_merge_conflict.png"/>
+                    <pic:cNvPicPr/>
+                  </pic:nvPicPr>
+                  <pic:blipFill>
+                    <a:blip r:embed="rId18"/>
+                    <a:stretch>
+                      <a:fillRect/>
+                    </a:stretch>
+                  </pic:blipFill>
+                  <pic:spPr>
+                    <a:xfrm>
+                      <a:off x="0" y="0"/>
+                      <a:ext cx="5486400" cy="754144"/>
+                    </a:xfrm>
+                    <a:prstGeom prst="rect"/>
+                  </pic:spPr>
+                </pic:pic>
+              </a:graphicData>
+            </a:graphic>
+          </wp:inline>
+        </w:drawing>
+      </w:r>
+    </w:p>
+    <w:p/>
+    <w:p>
+      <w:r>
+        <w:drawing>
+          <wp:inline xmlns:a="http://schemas.openxmlformats.org/drawingml/2006/main" xmlns:pic="http://schemas.openxmlformats.org/drawingml/2006/picture">
+            <wp:extent cx="5486400" cy="3071812"/>
+            <wp:docPr id="11" name="Picture 11"/>
+            <wp:cNvGraphicFramePr>
+              <a:graphicFrameLocks noChangeAspect="1"/>
+            </wp:cNvGraphicFramePr>
+            <a:graphic>
+              <a:graphicData uri="http://schemas.openxmlformats.org/drawingml/2006/picture">
+                <pic:pic>
+                  <pic:nvPicPr>
+                    <pic:cNvPr id="0" name="screenshot_q3_conflict_markers.png"/>
+                    <pic:cNvPicPr/>
+                  </pic:nvPicPr>
+                  <pic:blipFill>
+                    <a:blip r:embed="rId19"/>
+                    <a:stretch>
+                      <a:fillRect/>
+                    </a:stretch>
+                  </pic:blipFill>
+                  <pic:spPr>
+                    <a:xfrm>
+                      <a:off x="0" y="0"/>
+                      <a:ext cx="5486400" cy="3071812"/>
+                    </a:xfrm>
+                    <a:prstGeom prst="rect"/>
+                  </pic:spPr>
+                </pic:pic>
+              </a:graphicData>
+            </a:graphic>
+          </wp:inline>
+        </w:drawing>
+      </w:r>
+    </w:p>
+    <w:p/>
+    <w:p>
+      <w:r>
+        <w:drawing>
+          <wp:inline xmlns:a="http://schemas.openxmlformats.org/drawingml/2006/main" xmlns:pic="http://schemas.openxmlformats.org/drawingml/2006/picture">
+            <wp:extent cx="5486400" cy="2428875"/>
+            <wp:docPr id="12" name="Picture 12"/>
+            <wp:cNvGraphicFramePr>
+              <a:graphicFrameLocks noChangeAspect="1"/>
+            </wp:cNvGraphicFramePr>
+            <a:graphic>
+              <a:graphicData uri="http://schemas.openxmlformats.org/drawingml/2006/picture">
+                <pic:pic>
+                  <pic:nvPicPr>
+                    <pic:cNvPr id="0" name="screenshot_q3_resolved_file.png"/>
+                    <pic:cNvPicPr/>
+                  </pic:nvPicPr>
+                  <pic:blipFill>
+                    <a:blip r:embed="rId20"/>
+                    <a:stretch>
+                      <a:fillRect/>
+                    </a:stretch>
+                  </pic:blipFill>
+                  <pic:spPr>
+                    <a:xfrm>
+                      <a:off x="0" y="0"/>
+                      <a:ext cx="5486400" cy="2428875"/>
+                    </a:xfrm>
+                    <a:prstGeom prst="rect"/>
+                  </pic:spPr>
+                </pic:pic>
+              </a:graphicData>
+            </a:graphic>
+          </wp:inline>
+        </w:drawing>
+      </w:r>
+    </w:p>
+    <w:p/>
+    <w:p>
+      <w:r>
+        <w:drawing>
+          <wp:inline xmlns:a="http://schemas.openxmlformats.org/drawingml/2006/main" xmlns:pic="http://schemas.openxmlformats.org/drawingml/2006/picture">
+            <wp:extent cx="5486400" cy="357188"/>
+            <wp:docPr id="13" name="Picture 13"/>
+            <wp:cNvGraphicFramePr>
+              <a:graphicFrameLocks noChangeAspect="1"/>
+            </wp:cNvGraphicFramePr>
+            <a:graphic>
+              <a:graphicData uri="http://schemas.openxmlformats.org/drawingml/2006/picture">
+                <pic:pic>
+                  <pic:nvPicPr>
+                    <pic:cNvPr id="0" name="screenshot_q3_resolve_commit.png"/>
+                    <pic:cNvPicPr/>
+                  </pic:nvPicPr>
+                  <pic:blipFill>
+                    <a:blip r:embed="rId21"/>
+                    <a:stretch>
+                      <a:fillRect/>
+                    </a:stretch>
+                  </pic:blipFill>
+                  <pic:spPr>
+                    <a:xfrm>
+                      <a:off x="0" y="0"/>
+                      <a:ext cx="5486400" cy="357188"/>
+                    </a:xfrm>
+                    <a:prstGeom prst="rect"/>
+                  </pic:spPr>
+                </pic:pic>
+              </a:graphicData>
+            </a:graphic>
+          </wp:inline>
+        </w:drawing>
+      </w:r>
+    </w:p>
+    <w:p/>
     <w:p>
       <w:r>
         <w:br w:type="page"/>
@@ -145,6 +626,154 @@
     </w:p>
     <w:p>
       <w:r>
+        <w:drawing>
+          <wp:inline xmlns:a="http://schemas.openxmlformats.org/drawingml/2006/main" xmlns:pic="http://schemas.openxmlformats.org/drawingml/2006/picture">
+            <wp:extent cx="5486400" cy="564444"/>
+            <wp:docPr id="14" name="Picture 14"/>
+            <wp:cNvGraphicFramePr>
+              <a:graphicFrameLocks noChangeAspect="1"/>
+            </wp:cNvGraphicFramePr>
+            <a:graphic>
+              <a:graphicData uri="http://schemas.openxmlformats.org/drawingml/2006/picture">
+                <pic:pic>
+                  <pic:nvPicPr>
+                    <pic:cNvPr id="0" name="screenshot_q4_stash.png"/>
+                    <pic:cNvPicPr/>
+                  </pic:nvPicPr>
+                  <pic:blipFill>
+                    <a:blip r:embed="rId22"/>
+                    <a:stretch>
+                      <a:fillRect/>
+                    </a:stretch>
+                  </pic:blipFill>
+                  <pic:spPr>
+                    <a:xfrm>
+                      <a:off x="0" y="0"/>
+                      <a:ext cx="5486400" cy="564444"/>
+                    </a:xfrm>
+                    <a:prstGeom prst="rect"/>
+                  </pic:spPr>
+                </pic:pic>
+              </a:graphicData>
+            </a:graphic>
+          </wp:inline>
+        </w:drawing>
+      </w:r>
+    </w:p>
+    <w:p/>
+    <w:p>
+      <w:r>
+        <w:drawing>
+          <wp:inline xmlns:a="http://schemas.openxmlformats.org/drawingml/2006/main" xmlns:pic="http://schemas.openxmlformats.org/drawingml/2006/picture">
+            <wp:extent cx="5486400" cy="749508"/>
+            <wp:docPr id="15" name="Picture 15"/>
+            <wp:cNvGraphicFramePr>
+              <a:graphicFrameLocks noChangeAspect="1"/>
+            </wp:cNvGraphicFramePr>
+            <a:graphic>
+              <a:graphicData uri="http://schemas.openxmlformats.org/drawingml/2006/picture">
+                <pic:pic>
+                  <pic:nvPicPr>
+                    <pic:cNvPr id="0" name="screenshot_q4_stash_list.png"/>
+                    <pic:cNvPicPr/>
+                  </pic:nvPicPr>
+                  <pic:blipFill>
+                    <a:blip r:embed="rId23"/>
+                    <a:stretch>
+                      <a:fillRect/>
+                    </a:stretch>
+                  </pic:blipFill>
+                  <pic:spPr>
+                    <a:xfrm>
+                      <a:off x="0" y="0"/>
+                      <a:ext cx="5486400" cy="749508"/>
+                    </a:xfrm>
+                    <a:prstGeom prst="rect"/>
+                  </pic:spPr>
+                </pic:pic>
+              </a:graphicData>
+            </a:graphic>
+          </wp:inline>
+        </w:drawing>
+      </w:r>
+    </w:p>
+    <w:p/>
+    <w:p>
+      <w:r>
+        <w:drawing>
+          <wp:inline xmlns:a="http://schemas.openxmlformats.org/drawingml/2006/main" xmlns:pic="http://schemas.openxmlformats.org/drawingml/2006/picture">
+            <wp:extent cx="5486400" cy="958645"/>
+            <wp:docPr id="16" name="Picture 16"/>
+            <wp:cNvGraphicFramePr>
+              <a:graphicFrameLocks noChangeAspect="1"/>
+            </wp:cNvGraphicFramePr>
+            <a:graphic>
+              <a:graphicData uri="http://schemas.openxmlformats.org/drawingml/2006/picture">
+                <pic:pic>
+                  <pic:nvPicPr>
+                    <pic:cNvPr id="0" name="screenshot_q4_stash_apply.png"/>
+                    <pic:cNvPicPr/>
+                  </pic:nvPicPr>
+                  <pic:blipFill>
+                    <a:blip r:embed="rId24"/>
+                    <a:stretch>
+                      <a:fillRect/>
+                    </a:stretch>
+                  </pic:blipFill>
+                  <pic:spPr>
+                    <a:xfrm>
+                      <a:off x="0" y="0"/>
+                      <a:ext cx="5486400" cy="958645"/>
+                    </a:xfrm>
+                    <a:prstGeom prst="rect"/>
+                  </pic:spPr>
+                </pic:pic>
+              </a:graphicData>
+            </a:graphic>
+          </wp:inline>
+        </w:drawing>
+      </w:r>
+    </w:p>
+    <w:p/>
+    <w:p>
+      <w:r>
+        <w:drawing>
+          <wp:inline xmlns:a="http://schemas.openxmlformats.org/drawingml/2006/main" xmlns:pic="http://schemas.openxmlformats.org/drawingml/2006/picture">
+            <wp:extent cx="5486400" cy="1143000"/>
+            <wp:docPr id="17" name="Picture 17"/>
+            <wp:cNvGraphicFramePr>
+              <a:graphicFrameLocks noChangeAspect="1"/>
+            </wp:cNvGraphicFramePr>
+            <a:graphic>
+              <a:graphicData uri="http://schemas.openxmlformats.org/drawingml/2006/picture">
+                <pic:pic>
+                  <pic:nvPicPr>
+                    <pic:cNvPr id="0" name="screenshot_q4_stash_log.png"/>
+                    <pic:cNvPicPr/>
+                  </pic:nvPicPr>
+                  <pic:blipFill>
+                    <a:blip r:embed="rId25"/>
+                    <a:stretch>
+                      <a:fillRect/>
+                    </a:stretch>
+                  </pic:blipFill>
+                  <pic:spPr>
+                    <a:xfrm>
+                      <a:off x="0" y="0"/>
+                      <a:ext cx="5486400" cy="1143000"/>
+                    </a:xfrm>
+                    <a:prstGeom prst="rect"/>
+                  </pic:spPr>
+                </pic:pic>
+              </a:graphicData>
+            </a:graphic>
+          </wp:inline>
+        </w:drawing>
+      </w:r>
+    </w:p>
+    <w:p/>
+    <w:p>
+      <w:r>
         <w:br w:type="page"/>
       </w:r>
     </w:p>
@@ -161,6 +790,117 @@
         <w:t>A 'bugfix' branch was used to develop a specific fix. The relevant commit was then cherry-picked into the 'main' branch, demonstrating an advanced git workflow for selective integration.</w:t>
       </w:r>
     </w:p>
+    <w:p>
+      <w:r>
+        <w:drawing>
+          <wp:inline xmlns:a="http://schemas.openxmlformats.org/drawingml/2006/main" xmlns:pic="http://schemas.openxmlformats.org/drawingml/2006/picture">
+            <wp:extent cx="5486400" cy="653143"/>
+            <wp:docPr id="18" name="Picture 18"/>
+            <wp:cNvGraphicFramePr>
+              <a:graphicFrameLocks noChangeAspect="1"/>
+            </wp:cNvGraphicFramePr>
+            <a:graphic>
+              <a:graphicData uri="http://schemas.openxmlformats.org/drawingml/2006/picture">
+                <pic:pic>
+                  <pic:nvPicPr>
+                    <pic:cNvPr id="0" name="screenshot_q6_cherrypick.png"/>
+                    <pic:cNvPicPr/>
+                  </pic:nvPicPr>
+                  <pic:blipFill>
+                    <a:blip r:embed="rId26"/>
+                    <a:stretch>
+                      <a:fillRect/>
+                    </a:stretch>
+                  </pic:blipFill>
+                  <pic:spPr>
+                    <a:xfrm>
+                      <a:off x="0" y="0"/>
+                      <a:ext cx="5486400" cy="653143"/>
+                    </a:xfrm>
+                    <a:prstGeom prst="rect"/>
+                  </pic:spPr>
+                </pic:pic>
+              </a:graphicData>
+            </a:graphic>
+          </wp:inline>
+        </w:drawing>
+      </w:r>
+    </w:p>
+    <w:p/>
+    <w:p>
+      <w:r>
+        <w:drawing>
+          <wp:inline xmlns:a="http://schemas.openxmlformats.org/drawingml/2006/main" xmlns:pic="http://schemas.openxmlformats.org/drawingml/2006/picture">
+            <wp:extent cx="5486400" cy="1042737"/>
+            <wp:docPr id="19" name="Picture 19"/>
+            <wp:cNvGraphicFramePr>
+              <a:graphicFrameLocks noChangeAspect="1"/>
+            </wp:cNvGraphicFramePr>
+            <a:graphic>
+              <a:graphicData uri="http://schemas.openxmlformats.org/drawingml/2006/picture">
+                <pic:pic>
+                  <pic:nvPicPr>
+                    <pic:cNvPr id="0" name="screenshot_q6_status.png"/>
+                    <pic:cNvPicPr/>
+                  </pic:nvPicPr>
+                  <pic:blipFill>
+                    <a:blip r:embed="rId27"/>
+                    <a:stretch>
+                      <a:fillRect/>
+                    </a:stretch>
+                  </pic:blipFill>
+                  <pic:spPr>
+                    <a:xfrm>
+                      <a:off x="0" y="0"/>
+                      <a:ext cx="5486400" cy="1042737"/>
+                    </a:xfrm>
+                    <a:prstGeom prst="rect"/>
+                  </pic:spPr>
+                </pic:pic>
+              </a:graphicData>
+            </a:graphic>
+          </wp:inline>
+        </w:drawing>
+      </w:r>
+    </w:p>
+    <w:p/>
+    <w:p>
+      <w:r>
+        <w:drawing>
+          <wp:inline xmlns:a="http://schemas.openxmlformats.org/drawingml/2006/main" xmlns:pic="http://schemas.openxmlformats.org/drawingml/2006/picture">
+            <wp:extent cx="5486400" cy="1143000"/>
+            <wp:docPr id="20" name="Picture 20"/>
+            <wp:cNvGraphicFramePr>
+              <a:graphicFrameLocks noChangeAspect="1"/>
+            </wp:cNvGraphicFramePr>
+            <a:graphic>
+              <a:graphicData uri="http://schemas.openxmlformats.org/drawingml/2006/picture">
+                <pic:pic>
+                  <pic:nvPicPr>
+                    <pic:cNvPr id="0" name="screenshot_q6_log.png"/>
+                    <pic:cNvPicPr/>
+                  </pic:nvPicPr>
+                  <pic:blipFill>
+                    <a:blip r:embed="rId28"/>
+                    <a:stretch>
+                      <a:fillRect/>
+                    </a:stretch>
+                  </pic:blipFill>
+                  <pic:spPr>
+                    <a:xfrm>
+                      <a:off x="0" y="0"/>
+                      <a:ext cx="5486400" cy="1143000"/>
+                    </a:xfrm>
+                    <a:prstGeom prst="rect"/>
+                  </pic:spPr>
+                </pic:pic>
+              </a:graphicData>
+            </a:graphic>
+          </wp:inline>
+        </w:drawing>
+      </w:r>
+    </w:p>
+    <w:p/>
     <w:p>
       <w:r>
         <w:br w:type="page"/>

</xml_diff>